<commit_message>
Mailing templates: botao Agora nao trocado por Estou com duvida
Co-authored-by: Cursor <cursoragent@cursor.com>
</commit_message>
<xml_diff>
--- a/docs/WhatsApp_Templates_Mailing_Mercado.docx
+++ b/docs/WhatsApp_Templates_Mailing_Mercado.docx
@@ -40,7 +40,7 @@
           <w:b w:val="0"/>
           <w:sz w:val="22"/>
         </w:rPr>
-        <w:t>Mensagens curtas para induzir o cliente a pedir informação. Sem preço, promoção ou pitch. Botões: Falar conosco | Agora não.</w:t>
+        <w:t>Mensagens curtas para induzir o cliente a pedir informação. Sem preço, promoção ou pitch. Botões: Falar conosco | Estou com dúvida.</w:t>
       </w:r>
     </w:p>
     <w:p>
@@ -404,7 +404,7 @@
           <w:b w:val="0"/>
           <w:sz w:val="22"/>
         </w:rPr>
-        <w:t>2. Agora não</w:t>
+        <w:t>2. Estou com dúvida</w:t>
       </w:r>
     </w:p>
     <w:p>
@@ -955,7 +955,7 @@
           <w:b w:val="0"/>
           <w:sz w:val="22"/>
         </w:rPr>
-        <w:t>2. Agora não</w:t>
+        <w:t>2. Estou com dúvida</w:t>
       </w:r>
     </w:p>
     <w:p>
@@ -1506,7 +1506,7 @@
           <w:b w:val="0"/>
           <w:sz w:val="22"/>
         </w:rPr>
-        <w:t>2. Agora não</w:t>
+        <w:t>2. Estou com dúvida</w:t>
       </w:r>
     </w:p>
     <w:p>
@@ -2057,7 +2057,7 @@
           <w:b w:val="0"/>
           <w:sz w:val="22"/>
         </w:rPr>
-        <w:t>2. Agora não</w:t>
+        <w:t>2. Estou com dúvida</w:t>
       </w:r>
     </w:p>
     <w:p>
@@ -2661,7 +2661,7 @@
           <w:b w:val="0"/>
           <w:sz w:val="22"/>
         </w:rPr>
-        <w:t>2. Agora não</w:t>
+        <w:t>2. Estou com dúvida</w:t>
       </w:r>
     </w:p>
     <w:p>
@@ -3265,7 +3265,7 @@
           <w:b w:val="0"/>
           <w:sz w:val="22"/>
         </w:rPr>
-        <w:t>2. Agora não</w:t>
+        <w:t>2. Estou com dúvida</w:t>
       </w:r>
     </w:p>
     <w:p>
@@ -3869,7 +3869,7 @@
           <w:b w:val="0"/>
           <w:sz w:val="22"/>
         </w:rPr>
-        <w:t>2. Agora não</w:t>
+        <w:t>2. Estou com dúvida</w:t>
       </w:r>
     </w:p>
     <w:p>
@@ -4420,7 +4420,7 @@
           <w:b w:val="0"/>
           <w:sz w:val="22"/>
         </w:rPr>
-        <w:t>2. Agora não</w:t>
+        <w:t>2. Estou com dúvida</w:t>
       </w:r>
     </w:p>
     <w:p>

</xml_diff>